<commit_message>
Issue 003: book mockup patched to No.003 + blue-brand promo card set
- Issue_003_Book_Mockup.png: cover pill and spine now read ISSUE
  No.003 (glyph-level patch of the pasted 002 mockup; orientation and
  paper texture preserved)
- Blue-brand variants of the three promo cards (white / royal blue
  #4A6CF7 / navy #101A3C) matching the book-mockup and datumlab.xyz
  brand language, rendered via a PROMO_THEME=brand toggle in
  promo_common.py; the cream report-palette originals stay on disk
- Clip pack + both article docx rebuilt to embed the brand variants
  so the X/LinkedIn graphics stay consistent with the mockup

Co-Authored-By: Claude Fable 5 <noreply@anthropic.com>
</commit_message>
<xml_diff>
--- a/content/reports/distribution/Issue_003_Clip_Pack_Consolidation.docx
+++ b/content/reports/distribution/Issue_003_Clip_Pack_Consolidation.docx
@@ -225,7 +225,7 @@
           <w:sz w:val="18"/>
           <w:szCs w:val="18"/>
         </w:rPr>
-        <w:t xml:space="preserve">335 characters  ·  attach: twitter-promo-sector-paradox.png</w:t>
+        <w:t xml:space="preserve">335 characters  ·  attach: twitter-promo-sector-paradox-brand.png</w:t>
       </w:r>
     </w:p>
     <w:p>
@@ -298,7 +298,7 @@
           <w:sz w:val="18"/>
           <w:szCs w:val="18"/>
         </w:rPr>
-        <w:t xml:space="preserve">309 characters  ·  attach: twitter-promo-aave-wrong-asset.png</w:t>
+        <w:t xml:space="preserve">309 characters  ·  attach: twitter-promo-aave-wrong-asset-brand.png</w:t>
       </w:r>
     </w:p>
     <w:p>
@@ -638,7 +638,7 @@
           <w:sz w:val="18"/>
           <w:szCs w:val="18"/>
         </w:rPr>
-        <w:t xml:space="preserve">276 characters  ·  attach: twitter-promo-concentration-94-5.png</w:t>
+        <w:t xml:space="preserve">276 characters  ·  attach: twitter-promo-concentration-94-5-brand.png</w:t>
       </w:r>
     </w:p>
     <w:p>
@@ -726,7 +726,7 @@
           <w:sz w:val="18"/>
           <w:szCs w:val="18"/>
         </w:rPr>
-        <w:t xml:space="preserve">292 characters  ·  attach: twitter-promo-sector-paradox.png</w:t>
+        <w:t xml:space="preserve">292 characters  ·  attach: twitter-promo-sector-paradox-brand.png</w:t>
       </w:r>
     </w:p>
     <w:p>
@@ -799,7 +799,7 @@
           <w:sz w:val="18"/>
           <w:szCs w:val="18"/>
         </w:rPr>
-        <w:t xml:space="preserve">264 characters  ·  attach: twitter-promo-aave-wrong-asset.png</w:t>
+        <w:t xml:space="preserve">264 characters  ·  attach: twitter-promo-aave-wrong-asset-brand.png</w:t>
       </w:r>
     </w:p>
     <w:p>

</xml_diff>

<commit_message>
Issue 003 promo cards: UI-sans typography, revert to report palette
Feedback round: the royal-blue-on-white brand variants read oddly,
and the serif/mono mix was too ornate. Cards now set everything in
the Segoe UI stack (titles, numbers, letterspaced kickers) on the
original cream/cobalt/terracotta palette. Docx artifacts re-point
at the updated base PNGs; the -brand variants stay on disk but are
superseded.

Co-Authored-By: Claude Fable 5 <noreply@anthropic.com>
</commit_message>
<xml_diff>
--- a/content/reports/distribution/Issue_003_Clip_Pack_Consolidation.docx
+++ b/content/reports/distribution/Issue_003_Clip_Pack_Consolidation.docx
@@ -225,7 +225,7 @@
           <w:sz w:val="18"/>
           <w:szCs w:val="18"/>
         </w:rPr>
-        <w:t xml:space="preserve">335 characters  ·  attach: twitter-promo-sector-paradox-brand.png</w:t>
+        <w:t xml:space="preserve">335 characters  ·  attach: twitter-promo-sector-paradox.png</w:t>
       </w:r>
     </w:p>
     <w:p>
@@ -298,7 +298,7 @@
           <w:sz w:val="18"/>
           <w:szCs w:val="18"/>
         </w:rPr>
-        <w:t xml:space="preserve">309 characters  ·  attach: twitter-promo-aave-wrong-asset-brand.png</w:t>
+        <w:t xml:space="preserve">309 characters  ·  attach: twitter-promo-aave-wrong-asset.png</w:t>
       </w:r>
     </w:p>
     <w:p>
@@ -638,7 +638,7 @@
           <w:sz w:val="18"/>
           <w:szCs w:val="18"/>
         </w:rPr>
-        <w:t xml:space="preserve">276 characters  ·  attach: twitter-promo-concentration-94-5-brand.png</w:t>
+        <w:t xml:space="preserve">276 characters  ·  attach: twitter-promo-concentration-94-5.png</w:t>
       </w:r>
     </w:p>
     <w:p>
@@ -726,7 +726,7 @@
           <w:sz w:val="18"/>
           <w:szCs w:val="18"/>
         </w:rPr>
-        <w:t xml:space="preserve">292 characters  ·  attach: twitter-promo-sector-paradox-brand.png</w:t>
+        <w:t xml:space="preserve">292 characters  ·  attach: twitter-promo-sector-paradox.png</w:t>
       </w:r>
     </w:p>
     <w:p>
@@ -799,7 +799,7 @@
           <w:sz w:val="18"/>
           <w:szCs w:val="18"/>
         </w:rPr>
-        <w:t xml:space="preserve">264 characters  ·  attach: twitter-promo-aave-wrong-asset-brand.png</w:t>
+        <w:t xml:space="preserve">264 characters  ·  attach: twitter-promo-aave-wrong-asset.png</w:t>
       </w:r>
     </w:p>
     <w:p>

</xml_diff>